<commit_message>
Added api and prompt
</commit_message>
<xml_diff>
--- a/prompt_base.docx
+++ b/prompt_base.docx
@@ -139,36 +139,16 @@
           <w:lang w:val="es-PE" w:eastAsia="es-PE"/>
           <w14:ligatures w14:val="none"/>
         </w:rPr>
-        <w:t xml:space="preserve">Planificación curricular con </w:t>
-      </w:r>
-      <w:proofErr w:type="gramStart"/>
-      <w:r>
-        <w:rPr>
-          <w:rFonts w:ascii="Times New Roman" w:eastAsia="Times New Roman" w:hAnsi="Times New Roman" w:cs="Times New Roman"/>
-          <w:kern w:val="0"/>
-          <w:lang w:val="es-PE" w:eastAsia="es-PE"/>
-          <w14:ligatures w14:val="none"/>
-        </w:rPr>
-        <w:t>IA</w:t>
-      </w:r>
-      <w:r>
-        <w:rPr>
-          <w:rFonts w:ascii="Times New Roman" w:eastAsia="Times New Roman" w:hAnsi="Times New Roman" w:cs="Times New Roman"/>
-          <w:kern w:val="0"/>
-          <w:lang w:val="es-PE" w:eastAsia="es-PE"/>
-          <w14:ligatures w14:val="none"/>
-        </w:rPr>
-        <w:t>”*</w:t>
-      </w:r>
-      <w:proofErr w:type="gramEnd"/>
-      <w:r>
-        <w:rPr>
-          <w:rFonts w:ascii="Times New Roman" w:eastAsia="Times New Roman" w:hAnsi="Times New Roman" w:cs="Times New Roman"/>
-          <w:kern w:val="0"/>
-          <w:lang w:val="es-PE" w:eastAsia="es-PE"/>
-          <w14:ligatures w14:val="none"/>
-        </w:rPr>
-        <w:t>*</w:t>
+        <w:t>Planificación curricular con IA</w:t>
+      </w:r>
+      <w:r>
+        <w:rPr>
+          <w:rFonts w:ascii="Times New Roman" w:eastAsia="Times New Roman" w:hAnsi="Times New Roman" w:cs="Times New Roman"/>
+          <w:kern w:val="0"/>
+          <w:lang w:val="es-PE" w:eastAsia="es-PE"/>
+          <w14:ligatures w14:val="none"/>
+        </w:rPr>
+        <w:t>”**</w:t>
       </w:r>
       <w:r>
         <w:rPr>
@@ -309,27 +289,7 @@
           <w:lang w:val="es-PE" w:eastAsia="es-PE"/>
           <w14:ligatures w14:val="none"/>
         </w:rPr>
-        <w:t>**</w:t>
-      </w:r>
-      <w:proofErr w:type="gramStart"/>
-      <w:r>
-        <w:rPr>
-          <w:rFonts w:ascii="Times New Roman" w:eastAsia="Times New Roman" w:hAnsi="Times New Roman" w:cs="Times New Roman"/>
-          <w:kern w:val="0"/>
-          <w:lang w:val="es-PE" w:eastAsia="es-PE"/>
-          <w14:ligatures w14:val="none"/>
-        </w:rPr>
-        <w:t>DEBES:*</w:t>
-      </w:r>
-      <w:proofErr w:type="gramEnd"/>
-      <w:r>
-        <w:rPr>
-          <w:rFonts w:ascii="Times New Roman" w:eastAsia="Times New Roman" w:hAnsi="Times New Roman" w:cs="Times New Roman"/>
-          <w:kern w:val="0"/>
-          <w:lang w:val="es-PE" w:eastAsia="es-PE"/>
-          <w14:ligatures w14:val="none"/>
-        </w:rPr>
-        <w:t>*</w:t>
+        <w:t>**DEBES:**</w:t>
       </w:r>
     </w:p>
     <w:p>
@@ -424,27 +384,7 @@
           <w:lang w:val="es-PE" w:eastAsia="es-PE"/>
           <w14:ligatures w14:val="none"/>
         </w:rPr>
-        <w:t xml:space="preserve">**NO </w:t>
-      </w:r>
-      <w:proofErr w:type="gramStart"/>
-      <w:r>
-        <w:rPr>
-          <w:rFonts w:ascii="Times New Roman" w:eastAsia="Times New Roman" w:hAnsi="Times New Roman" w:cs="Times New Roman"/>
-          <w:kern w:val="0"/>
-          <w:lang w:val="es-PE" w:eastAsia="es-PE"/>
-          <w14:ligatures w14:val="none"/>
-        </w:rPr>
-        <w:t>DEBES:*</w:t>
-      </w:r>
-      <w:proofErr w:type="gramEnd"/>
-      <w:r>
-        <w:rPr>
-          <w:rFonts w:ascii="Times New Roman" w:eastAsia="Times New Roman" w:hAnsi="Times New Roman" w:cs="Times New Roman"/>
-          <w:kern w:val="0"/>
-          <w:lang w:val="es-PE" w:eastAsia="es-PE"/>
-          <w14:ligatures w14:val="none"/>
-        </w:rPr>
-        <w:t>*</w:t>
+        <w:t>**NO DEBES:**</w:t>
       </w:r>
     </w:p>
     <w:p>
@@ -641,27 +581,7 @@
           <w:lang w:val="es-PE" w:eastAsia="es-PE"/>
           <w14:ligatures w14:val="none"/>
         </w:rPr>
-        <w:t xml:space="preserve"> relacionada a un tema fuera de la base de conocimiento que tienes, dirige al usuario de manera amable a los canales de atención del </w:t>
-      </w:r>
-      <w:proofErr w:type="spellStart"/>
-      <w:r>
-        <w:rPr>
-          <w:rFonts w:ascii="Times New Roman" w:eastAsia="Times New Roman" w:hAnsi="Times New Roman" w:cs="Times New Roman"/>
-          <w:kern w:val="0"/>
-          <w:lang w:val="es-PE" w:eastAsia="es-PE"/>
-          <w14:ligatures w14:val="none"/>
-        </w:rPr>
-        <w:t>Sifods</w:t>
-      </w:r>
-      <w:proofErr w:type="spellEnd"/>
-      <w:r>
-        <w:rPr>
-          <w:rFonts w:ascii="Times New Roman" w:eastAsia="Times New Roman" w:hAnsi="Times New Roman" w:cs="Times New Roman"/>
-          <w:kern w:val="0"/>
-          <w:lang w:val="es-PE" w:eastAsia="es-PE"/>
-          <w14:ligatures w14:val="none"/>
-        </w:rPr>
-        <w:t>, indicand</w:t>
+        <w:t xml:space="preserve"> relacionada a un tema fuera de la base de conocimiento que tienes, dirige al usuario de manera amable a los canales de atención del Sifods, indicand</w:t>
       </w:r>
       <w:r>
         <w:rPr>
@@ -810,7 +730,7 @@
           <w:lang w:val="es-PE" w:eastAsia="es-PE"/>
           <w14:ligatures w14:val="none"/>
         </w:rPr>
-        <w:t>--</w:t>
+        <w:t>-</w:t>
       </w:r>
       <w:r>
         <w:rPr>
@@ -1030,36 +950,16 @@
           <w:lang w:val="es-PE" w:eastAsia="es-PE"/>
           <w14:ligatures w14:val="none"/>
         </w:rPr>
-        <w:t xml:space="preserve">analizar una situación pedagógica o una duda conceptual relacionada con los cursos del </w:t>
-      </w:r>
-      <w:proofErr w:type="gramStart"/>
-      <w:r>
-        <w:rPr>
-          <w:rFonts w:ascii="Times New Roman" w:eastAsia="Times New Roman" w:hAnsi="Times New Roman" w:cs="Times New Roman"/>
-          <w:kern w:val="0"/>
-          <w:lang w:val="es-PE" w:eastAsia="es-PE"/>
-          <w14:ligatures w14:val="none"/>
-        </w:rPr>
-        <w:t>programa.</w:t>
-      </w:r>
-      <w:r>
-        <w:rPr>
-          <w:rFonts w:ascii="Times New Roman" w:eastAsia="Times New Roman" w:hAnsi="Times New Roman" w:cs="Times New Roman"/>
-          <w:kern w:val="0"/>
-          <w:lang w:val="es-PE" w:eastAsia="es-PE"/>
-          <w14:ligatures w14:val="none"/>
-        </w:rPr>
-        <w:t>*</w:t>
-      </w:r>
-      <w:proofErr w:type="gramEnd"/>
-      <w:r>
-        <w:rPr>
-          <w:rFonts w:ascii="Times New Roman" w:eastAsia="Times New Roman" w:hAnsi="Times New Roman" w:cs="Times New Roman"/>
-          <w:kern w:val="0"/>
-          <w:lang w:val="es-PE" w:eastAsia="es-PE"/>
-          <w14:ligatures w14:val="none"/>
-        </w:rPr>
-        <w:t>*</w:t>
+        <w:t>analizar una situación pedagógica o una duda conceptual relacionada con los cursos del programa.</w:t>
+      </w:r>
+      <w:r>
+        <w:rPr>
+          <w:rFonts w:ascii="Times New Roman" w:eastAsia="Times New Roman" w:hAnsi="Times New Roman" w:cs="Times New Roman"/>
+          <w:kern w:val="0"/>
+          <w:lang w:val="es-PE" w:eastAsia="es-PE"/>
+          <w14:ligatures w14:val="none"/>
+        </w:rPr>
+        <w:t>**</w:t>
       </w:r>
       <w:r>
         <w:rPr>
@@ -1144,19 +1044,8 @@
           <w:lang w:val="es-PE" w:eastAsia="es-PE"/>
           <w14:ligatures w14:val="none"/>
         </w:rPr>
-        <w:t xml:space="preserve">- </w:t>
-      </w:r>
-      <w:proofErr w:type="gramStart"/>
-      <w:r>
-        <w:rPr>
-          <w:rFonts w:ascii="Times New Roman" w:eastAsia="Times New Roman" w:hAnsi="Times New Roman" w:cs="Times New Roman"/>
-          <w:kern w:val="0"/>
-          <w:lang w:val="es-PE" w:eastAsia="es-PE"/>
-          <w14:ligatures w14:val="none"/>
-        </w:rPr>
-        <w:t>Español</w:t>
-      </w:r>
-      <w:proofErr w:type="gramEnd"/>
+        <w:t>- Español</w:t>
+      </w:r>
     </w:p>
     <w:p>
       <w:pPr>
@@ -1212,27 +1101,7 @@
           <w:lang w:val="es-PE" w:eastAsia="es-PE"/>
           <w14:ligatures w14:val="none"/>
         </w:rPr>
-        <w:t>- Incluye sección **“</w:t>
-      </w:r>
-      <w:proofErr w:type="gramStart"/>
-      <w:r>
-        <w:rPr>
-          <w:rFonts w:ascii="Times New Roman" w:eastAsia="Times New Roman" w:hAnsi="Times New Roman" w:cs="Times New Roman"/>
-          <w:kern w:val="0"/>
-          <w:lang w:val="es-PE" w:eastAsia="es-PE"/>
-          <w14:ligatures w14:val="none"/>
-        </w:rPr>
-        <w:t>Referencias”*</w:t>
-      </w:r>
-      <w:proofErr w:type="gramEnd"/>
-      <w:r>
-        <w:rPr>
-          <w:rFonts w:ascii="Times New Roman" w:eastAsia="Times New Roman" w:hAnsi="Times New Roman" w:cs="Times New Roman"/>
-          <w:kern w:val="0"/>
-          <w:lang w:val="es-PE" w:eastAsia="es-PE"/>
-          <w14:ligatures w14:val="none"/>
-        </w:rPr>
-        <w:t>* al final</w:t>
+        <w:t>- Incluye sección **“Referencias”** al final</w:t>
       </w:r>
     </w:p>
     <w:p>
@@ -1383,27 +1252,7 @@
           <w:lang w:val="es-PE" w:eastAsia="es-PE"/>
           <w14:ligatures w14:val="none"/>
         </w:rPr>
-        <w:t>**Formato obligatorio (una por línea</w:t>
-      </w:r>
-      <w:proofErr w:type="gramStart"/>
-      <w:r>
-        <w:rPr>
-          <w:rFonts w:ascii="Times New Roman" w:eastAsia="Times New Roman" w:hAnsi="Times New Roman" w:cs="Times New Roman"/>
-          <w:kern w:val="0"/>
-          <w:lang w:val="es-PE" w:eastAsia="es-PE"/>
-          <w14:ligatures w14:val="none"/>
-        </w:rPr>
-        <w:t>):*</w:t>
-      </w:r>
-      <w:proofErr w:type="gramEnd"/>
-      <w:r>
-        <w:rPr>
-          <w:rFonts w:ascii="Times New Roman" w:eastAsia="Times New Roman" w:hAnsi="Times New Roman" w:cs="Times New Roman"/>
-          <w:kern w:val="0"/>
-          <w:lang w:val="es-PE" w:eastAsia="es-PE"/>
-          <w14:ligatures w14:val="none"/>
-        </w:rPr>
-        <w:t>*</w:t>
+        <w:t>**Formato obligatorio (una por línea):**</w:t>
       </w:r>
     </w:p>
     <w:p>
@@ -1423,19 +1272,8 @@
           <w14:ligatures w14:val="none"/>
         </w:rPr>
         <w:lastRenderedPageBreak/>
-        <w:t xml:space="preserve">- </w:t>
-      </w:r>
-      <w:proofErr w:type="spellStart"/>
-      <w:r>
-        <w:rPr>
-          <w:rFonts w:ascii="Times New Roman" w:eastAsia="Times New Roman" w:hAnsi="Times New Roman" w:cs="Times New Roman"/>
-          <w:kern w:val="0"/>
-          <w:lang w:val="es-PE" w:eastAsia="es-PE"/>
-          <w14:ligatures w14:val="none"/>
-        </w:rPr>
-        <w:t>Nombre_del_archivo</w:t>
-      </w:r>
-      <w:proofErr w:type="spellEnd"/>
+        <w:t>- Nombre_del_archivo</w:t>
+      </w:r>
     </w:p>
     <w:p>
       <w:pPr>
@@ -1472,27 +1310,7 @@
           <w:lang w:val="es-PE" w:eastAsia="es-PE"/>
           <w14:ligatures w14:val="none"/>
         </w:rPr>
-        <w:t>**</w:t>
-      </w:r>
-      <w:proofErr w:type="gramStart"/>
-      <w:r>
-        <w:rPr>
-          <w:rFonts w:ascii="Times New Roman" w:eastAsia="Times New Roman" w:hAnsi="Times New Roman" w:cs="Times New Roman"/>
-          <w:kern w:val="0"/>
-          <w:lang w:val="es-PE" w:eastAsia="es-PE"/>
-          <w14:ligatures w14:val="none"/>
-        </w:rPr>
-        <w:t>PROHIBIDO:*</w:t>
-      </w:r>
-      <w:proofErr w:type="gramEnd"/>
-      <w:r>
-        <w:rPr>
-          <w:rFonts w:ascii="Times New Roman" w:eastAsia="Times New Roman" w:hAnsi="Times New Roman" w:cs="Times New Roman"/>
-          <w:kern w:val="0"/>
-          <w:lang w:val="es-PE" w:eastAsia="es-PE"/>
-          <w14:ligatures w14:val="none"/>
-        </w:rPr>
-        <w:t>*</w:t>
+        <w:t>**PROHIBIDO:**</w:t>
       </w:r>
     </w:p>
     <w:p>
@@ -1662,27 +1480,7 @@
           <w:lang w:val="es-PE" w:eastAsia="es-PE"/>
           <w14:ligatures w14:val="none"/>
         </w:rPr>
-        <w:t>{</w:t>
-      </w:r>
-      <w:proofErr w:type="spellStart"/>
-      <w:r>
-        <w:rPr>
-          <w:rFonts w:ascii="Times New Roman" w:eastAsia="Times New Roman" w:hAnsi="Times New Roman" w:cs="Times New Roman"/>
-          <w:kern w:val="0"/>
-          <w:lang w:val="es-PE" w:eastAsia="es-PE"/>
-          <w14:ligatures w14:val="none"/>
-        </w:rPr>
-        <w:t>context</w:t>
-      </w:r>
-      <w:proofErr w:type="spellEnd"/>
-      <w:r>
-        <w:rPr>
-          <w:rFonts w:ascii="Times New Roman" w:eastAsia="Times New Roman" w:hAnsi="Times New Roman" w:cs="Times New Roman"/>
-          <w:kern w:val="0"/>
-          <w:lang w:val="es-PE" w:eastAsia="es-PE"/>
-          <w14:ligatures w14:val="none"/>
-        </w:rPr>
-        <w:t>}</w:t>
+        <w:t>{context}</w:t>
       </w:r>
     </w:p>
     <w:p>
@@ -1720,27 +1518,7 @@
           <w:lang w:val="es-PE" w:eastAsia="es-PE"/>
           <w14:ligatures w14:val="none"/>
         </w:rPr>
-        <w:t>{</w:t>
-      </w:r>
-      <w:proofErr w:type="spellStart"/>
-      <w:r>
-        <w:rPr>
-          <w:rFonts w:ascii="Times New Roman" w:eastAsia="Times New Roman" w:hAnsi="Times New Roman" w:cs="Times New Roman"/>
-          <w:kern w:val="0"/>
-          <w:lang w:val="es-PE" w:eastAsia="es-PE"/>
-          <w14:ligatures w14:val="none"/>
-        </w:rPr>
-        <w:t>question</w:t>
-      </w:r>
-      <w:proofErr w:type="spellEnd"/>
-      <w:r>
-        <w:rPr>
-          <w:rFonts w:ascii="Times New Roman" w:eastAsia="Times New Roman" w:hAnsi="Times New Roman" w:cs="Times New Roman"/>
-          <w:kern w:val="0"/>
-          <w:lang w:val="es-PE" w:eastAsia="es-PE"/>
-          <w14:ligatures w14:val="none"/>
-        </w:rPr>
-        <w:t>}</w:t>
+        <w:t>{question}</w:t>
       </w:r>
     </w:p>
     <w:p>

</xml_diff>